<commit_message>
NYC Taxi Data Analysis PDF report added
</commit_message>
<xml_diff>
--- a/NYC Taxi Data Analysis/NYC_Taxi_Data_Analysis_Report.docx
+++ b/NYC Taxi Data Analysis/NYC_Taxi_Data_Analysis_Report.docx
@@ -730,6 +730,12 @@
     <w:p>
       <w:pPr>
         <w:spacing w:before="80" w:after="40"/>
+        <w:rPr>
+          <w:rFonts w:ascii="Calibri" w:hAnsi="Calibri"/>
+          <w:b/>
+          <w:color w:val="1E293B"/>
+          <w:sz w:val="21"/>
+        </w:rPr>
       </w:pPr>
       <w:r>
         <w:rPr>
@@ -739,6 +745,15 @@
           <w:sz w:val="21"/>
         </w:rPr>
         <w:t>Dataset Schema Description (jan_taxi.csv):</w:t>
+      </w:r>
+      <w:r>
+        <w:rPr>
+          <w:rFonts w:ascii="Calibri" w:hAnsi="Calibri"/>
+          <w:b/>
+          <w:color w:val="1E293B"/>
+          <w:sz w:val="21"/>
+        </w:rPr>
+        <w:t xml:space="preserve"> </w:t>
       </w:r>
     </w:p>
     <w:tbl>
@@ -16628,6 +16643,29 @@
       </w:tcPr>
     </w:tblStylePr>
   </w:style>
+  <w:style w:type="character" w:styleId="Hyperlink">
+    <w:name w:val="Hyperlink"/>
+    <w:basedOn w:val="DefaultParagraphFont"/>
+    <w:uiPriority w:val="99"/>
+    <w:unhideWhenUsed/>
+    <w:rsid w:val="00057CB2"/>
+    <w:rPr>
+      <w:color w:val="0000FF" w:themeColor="hyperlink"/>
+      <w:u w:val="single"/>
+    </w:rPr>
+  </w:style>
+  <w:style w:type="character" w:styleId="UnresolvedMention">
+    <w:name w:val="Unresolved Mention"/>
+    <w:basedOn w:val="DefaultParagraphFont"/>
+    <w:uiPriority w:val="99"/>
+    <w:semiHidden/>
+    <w:unhideWhenUsed/>
+    <w:rsid w:val="00057CB2"/>
+    <w:rPr>
+      <w:color w:val="605E5C"/>
+      <w:shd w:val="clear" w:color="auto" w:fill="E1DFDD"/>
+    </w:rPr>
+  </w:style>
 </w:styles>
 </file>
 

</xml_diff>